<commit_message>
Replace the sample input.docx author with a placeholder name
</commit_message>
<xml_diff>
--- a/Examples/developer-guide/advanced-usage/adding-metadata/input.docx
+++ b/Examples/developer-guide/advanced-usage/adding-metadata/input.docx
@@ -50,7 +50,7 @@
             <w:rPr>
               <w:lang w:val="uk-UA"/>
             </w:rPr>
-            <w:t>Prokofjev</w:t>
+            <w:t>Emily</w:t>
           </w:r>
           <w:proofErr w:type="spellEnd"/>
           <w:r>
@@ -64,7 +64,7 @@
             <w:rPr>
               <w:lang w:val="uk-UA"/>
             </w:rPr>
-            <w:t>Igor</w:t>
+            <w:t>Carter</w:t>
           </w:r>
           <w:proofErr w:type="spellEnd"/>
         </w:p>
@@ -139,7 +139,7 @@
 
 <file path=word/comments.xml><?xml version="1.0" encoding="utf-8"?>
 <w:comments xmlns:ve="http://schemas.openxmlformats.org/markup-compatibility/2006" xmlns:o="urn:schemas-microsoft-com:office:office" xmlns:r="http://schemas.openxmlformats.org/officeDocument/2006/relationships" xmlns:m="http://schemas.openxmlformats.org/officeDocument/2006/math" xmlns:v="urn:schemas-microsoft-com:vml" xmlns:wp="http://schemas.openxmlformats.org/drawingml/2006/wordprocessingDrawing" xmlns:w10="urn:schemas-microsoft-com:office:word" xmlns:w="http://schemas.openxmlformats.org/wordprocessingml/2006/main" xmlns:wne="http://schemas.microsoft.com/office/word/2006/wordml">
-  <w:comment w:id="0" w:author="Prokofjev Igor" w:date="2016-03-22T20:11:00Z" w:initials="PI">
+  <w:comment w:id="0" w:author="Emily Carter" w:date="2016-03-22T20:11:00Z" w:initials="EC">
     <w:p>
       <w:pPr>
         <w:pStyle w:val="a4"/>

</xml_diff>